<commit_message>
Fill in Flutter stack, structure and architecture in Flutter report
Co-Authored-By: Claude Opus 5.5 <noreply@anthropic.com>
Claude-Session: https://claude.ai/code/session_01SWoaAp7q8y4S8UdG5ePDXy
</commit_message>
<xml_diff>
--- a/docs/Mini_Project_Report_Pawred_Flutter.docx
+++ b/docs/Mini_Project_Report_Pawred_Flutter.docx
@@ -946,6 +946,41 @@
           <w:p>
             <w:pPr/>
             <w:r>
+              <w:t xml:space="preserve">3.1</w:t>
+            </w:r>
+          </w:p>
+        </w:tc>
+        <w:tc>
+          <w:tcPr>
+            <w:tcW w:w="6530" w:type="dxa"/>
+          </w:tcPr>
+          <w:p>
+            <w:pPr/>
+            <w:r>
+              <w:t xml:space="preserve">Architecture of the Flutter app</w:t>
+            </w:r>
+          </w:p>
+        </w:tc>
+        <w:tc>
+          <w:tcPr>
+            <w:tcW w:w="1363" w:type="dxa"/>
+          </w:tcPr>
+          <w:p>
+            <w:pPr/>
+            <w:r>
+              <w:t xml:space="preserve">3</w:t>
+            </w:r>
+          </w:p>
+        </w:tc>
+      </w:tr>
+      <w:tr>
+        <w:tc>
+          <w:tcPr>
+            <w:tcW w:w="1466" w:type="dxa"/>
+          </w:tcPr>
+          <w:p>
+            <w:pPr/>
+            <w:r>
               <w:t xml:space="preserve">4.1</w:t>
             </w:r>
           </w:p>
@@ -1335,6 +1370,41 @@
             <w:pPr/>
             <w:r>
               <w:t xml:space="preserve">Functional test results</w:t>
+            </w:r>
+          </w:p>
+        </w:tc>
+        <w:tc>
+          <w:tcPr>
+            <w:tcW w:w="1333" w:type="dxa"/>
+          </w:tcPr>
+          <w:p>
+            <w:pPr/>
+            <w:r>
+              <w:t xml:space="preserve">4</w:t>
+            </w:r>
+          </w:p>
+        </w:tc>
+      </w:tr>
+      <w:tr>
+        <w:tc>
+          <w:tcPr>
+            <w:tcW w:w="1640" w:type="dxa"/>
+          </w:tcPr>
+          <w:p>
+            <w:pPr/>
+            <w:r>
+              <w:t xml:space="preserve">4.2</w:t>
+            </w:r>
+          </w:p>
+        </w:tc>
+        <w:tc>
+          <w:tcPr>
+            <w:tcW w:w="6386" w:type="dxa"/>
+          </w:tcPr>
+          <w:p>
+            <w:pPr/>
+            <w:r>
+              <w:t xml:space="preserve">Performance targets</w:t>
             </w:r>
           </w:p>
         </w:tc>
@@ -2965,16 +3035,7 @@
         <w:t xml:space="preserve">Technology stack.</w:t>
       </w:r>
       <w:r>
-        <w:t xml:space="preserve"> Rows in brackets must be filled in from the project's </w:t>
-      </w:r>
-      <w:r>
-        <w:rPr>
-          <w:rStyle w:val="CodeChar"/>
-        </w:rPr>
-        <w:t xml:space="preserve">pubspec.yaml</w:t>
-      </w:r>
-      <w:r>
-        <w:t xml:space="preserve">.</w:t>
+        <w:t xml:space="preserve"> The app uses the packages in Table 3.2. It talks to the same backend as the Pawred web app, so both apps share one database, one set of accounts and one set of matching rules.</w:t>
       </w:r>
     </w:p>
     <w:p>
@@ -2995,8 +3056,8 @@
       </w:tblPr>
       <w:tblGrid>
         <w:gridCol w:w="2189"/>
-        <w:gridCol w:w="3811"/>
-        <w:gridCol w:w="3360"/>
+        <w:gridCol w:w="3339"/>
+        <w:gridCol w:w="3832"/>
       </w:tblGrid>
       <w:tr>
         <w:trPr>
@@ -3016,7 +3077,7 @@
         </w:tc>
         <w:tc>
           <w:tcPr>
-            <w:tcW w:w="3811" w:type="dxa"/>
+            <w:tcW w:w="3339" w:type="dxa"/>
             <w:shd w:val="clear" w:color="auto" w:fill="F2F2F2"/>
           </w:tcPr>
           <w:p>
@@ -3028,7 +3089,7 @@
         </w:tc>
         <w:tc>
           <w:tcPr>
-            <w:tcW w:w="3360" w:type="dxa"/>
+            <w:tcW w:w="3832" w:type="dxa"/>
             <w:shd w:val="clear" w:color="auto" w:fill="F2F2F2"/>
           </w:tcPr>
           <w:p>
@@ -3053,18 +3114,18 @@
         </w:tc>
         <w:tc>
           <w:tcPr>
-            <w:tcW w:w="3811" w:type="dxa"/>
-          </w:tcPr>
-          <w:p>
-            <w:pPr/>
-            <w:r>
-              <w:t xml:space="preserve">Flutter [version]</w:t>
-            </w:r>
-          </w:p>
-        </w:tc>
-        <w:tc>
-          <w:tcPr>
-            <w:tcW w:w="3360" w:type="dxa"/>
+            <w:tcW w:w="3339" w:type="dxa"/>
+          </w:tcPr>
+          <w:p>
+            <w:pPr/>
+            <w:r>
+              <w:t xml:space="preserve">Flutter 3 (stable channel)</w:t>
+            </w:r>
+          </w:p>
+        </w:tc>
+        <w:tc>
+          <w:tcPr>
+            <w:tcW w:w="3832" w:type="dxa"/>
           </w:tcPr>
           <w:p>
             <w:pPr/>
@@ -3088,18 +3149,18 @@
         </w:tc>
         <w:tc>
           <w:tcPr>
-            <w:tcW w:w="3811" w:type="dxa"/>
-          </w:tcPr>
-          <w:p>
-            <w:pPr/>
-            <w:r>
-              <w:t xml:space="preserve">Dart</w:t>
-            </w:r>
-          </w:p>
-        </w:tc>
-        <w:tc>
-          <w:tcPr>
-            <w:tcW w:w="3360" w:type="dxa"/>
+            <w:tcW w:w="3339" w:type="dxa"/>
+          </w:tcPr>
+          <w:p>
+            <w:pPr/>
+            <w:r>
+              <w:t xml:space="preserve">Dart 3 with null safety</w:t>
+            </w:r>
+          </w:p>
+        </w:tc>
+        <w:tc>
+          <w:tcPr>
+            <w:tcW w:w="3832" w:type="dxa"/>
           </w:tcPr>
           <w:p>
             <w:pPr/>
@@ -3123,23 +3184,38 @@
         </w:tc>
         <w:tc>
           <w:tcPr>
-            <w:tcW w:w="3811" w:type="dxa"/>
-          </w:tcPr>
-          <w:p>
-            <w:pPr/>
-            <w:r>
-              <w:t xml:space="preserve">Flutter Material widgets with a custom theme</w:t>
-            </w:r>
-          </w:p>
-        </w:tc>
-        <w:tc>
-          <w:tcPr>
-            <w:tcW w:w="3360" w:type="dxa"/>
-          </w:tcPr>
-          <w:p>
-            <w:pPr/>
-            <w:r>
-              <w:t xml:space="preserve">Matches the Pawred colours and fonts</w:t>
+            <w:tcW w:w="3339" w:type="dxa"/>
+          </w:tcPr>
+          <w:p>
+            <w:pPr/>
+            <w:r>
+              <w:t xml:space="preserve">Material 3 widgets, custom </w:t>
+            </w:r>
+            <w:r>
+              <w:rPr>
+                <w:rStyle w:val="CodeChar"/>
+              </w:rPr>
+              <w:t xml:space="preserve">ThemeData</w:t>
+            </w:r>
+            <w:r>
+              <w:t xml:space="preserve">, </w:t>
+            </w:r>
+            <w:r>
+              <w:rPr>
+                <w:rStyle w:val="CodeChar"/>
+              </w:rPr>
+              <w:t xml:space="preserve">google_fonts</w:t>
+            </w:r>
+          </w:p>
+        </w:tc>
+        <w:tc>
+          <w:tcPr>
+            <w:tcW w:w="3832" w:type="dxa"/>
+          </w:tcPr>
+          <w:p>
+            <w:pPr/>
+            <w:r>
+              <w:t xml:space="preserve">Pawred colours, serif headings, rounded cards</w:t>
             </w:r>
           </w:p>
         </w:tc>
@@ -3152,29 +3228,82 @@
           <w:p>
             <w:pPr/>
             <w:r>
+              <w:t xml:space="preserve">Layouts</w:t>
+            </w:r>
+          </w:p>
+        </w:tc>
+        <w:tc>
+          <w:tcPr>
+            <w:tcW w:w="3339" w:type="dxa"/>
+          </w:tcPr>
+          <w:p>
+            <w:pPr/>
+            <w:r>
+              <w:rPr>
+                <w:rStyle w:val="CodeChar"/>
+              </w:rPr>
+              <w:t xml:space="preserve">flutter_staggered_grid_view</w:t>
+            </w:r>
+          </w:p>
+        </w:tc>
+        <w:tc>
+          <w:tcPr>
+            <w:tcW w:w="3832" w:type="dxa"/>
+          </w:tcPr>
+          <w:p>
+            <w:pPr/>
+            <w:r>
+              <w:t xml:space="preserve">Two-column masonry grid on Discover</w:t>
+            </w:r>
+          </w:p>
+        </w:tc>
+      </w:tr>
+      <w:tr>
+        <w:tc>
+          <w:tcPr>
+            <w:tcW w:w="2189" w:type="dxa"/>
+          </w:tcPr>
+          <w:p>
+            <w:pPr/>
+            <w:r>
               <w:t xml:space="preserve">Navigation</w:t>
             </w:r>
           </w:p>
         </w:tc>
         <w:tc>
           <w:tcPr>
-            <w:tcW w:w="3811" w:type="dxa"/>
-          </w:tcPr>
-          <w:p>
-            <w:pPr/>
-            <w:r>
-              <w:t xml:space="preserve">Bottom navigation bar: Discover, Likes you, Matches, Settings</w:t>
-            </w:r>
-          </w:p>
-        </w:tc>
-        <w:tc>
-          <w:tcPr>
-            <w:tcW w:w="3360" w:type="dxa"/>
-          </w:tcPr>
-          <w:p>
-            <w:pPr/>
-            <w:r>
-              <w:t xml:space="preserve">Moves between the main screens</w:t>
+            <w:tcW w:w="3339" w:type="dxa"/>
+          </w:tcPr>
+          <w:p>
+            <w:pPr/>
+            <w:r>
+              <w:rPr>
+                <w:rStyle w:val="CodeChar"/>
+              </w:rPr>
+              <w:t xml:space="preserve">go_router</w:t>
+            </w:r>
+            <w:r>
+              <w:t xml:space="preserve"> with a </w:t>
+            </w:r>
+            <w:r>
+              <w:rPr>
+                <w:rStyle w:val="CodeChar"/>
+              </w:rPr>
+              <w:t xml:space="preserve">ShellRoute</w:t>
+            </w:r>
+            <w:r>
+              <w:t xml:space="preserve"> bottom navigation bar</w:t>
+            </w:r>
+          </w:p>
+        </w:tc>
+        <w:tc>
+          <w:tcPr>
+            <w:tcW w:w="3832" w:type="dxa"/>
+          </w:tcPr>
+          <w:p>
+            <w:pPr/>
+            <w:r>
+              <w:t xml:space="preserve">Discover, Likes you, Matches and Settings tabs</w:t>
             </w:r>
           </w:p>
         </w:tc>
@@ -3193,23 +3322,26 @@
         </w:tc>
         <w:tc>
           <w:tcPr>
-            <w:tcW w:w="3811" w:type="dxa"/>
-          </w:tcPr>
-          <w:p>
-            <w:pPr/>
-            <w:r>
-              <w:t xml:space="preserve">[Provider / Riverpod / Bloc — fill in]</w:t>
-            </w:r>
-          </w:p>
-        </w:tc>
-        <w:tc>
-          <w:tcPr>
-            <w:tcW w:w="3360" w:type="dxa"/>
-          </w:tcPr>
-          <w:p>
-            <w:pPr/>
-            <w:r>
-              <w:t xml:space="preserve">Keeps screen data in sync</w:t>
+            <w:tcW w:w="3339" w:type="dxa"/>
+          </w:tcPr>
+          <w:p>
+            <w:pPr/>
+            <w:r>
+              <w:rPr>
+                <w:rStyle w:val="CodeChar"/>
+              </w:rPr>
+              <w:t xml:space="preserve">flutter_riverpod</w:t>
+            </w:r>
+          </w:p>
+        </w:tc>
+        <w:tc>
+          <w:tcPr>
+            <w:tcW w:w="3832" w:type="dxa"/>
+          </w:tcPr>
+          <w:p>
+            <w:pPr/>
+            <w:r>
+              <w:t xml:space="preserve">Providers for the session, active dog, Discover list, likes, matches and chat</w:t>
             </w:r>
           </w:p>
         </w:tc>
@@ -3222,29 +3354,32 @@
           <w:p>
             <w:pPr/>
             <w:r>
-              <w:t xml:space="preserve">Backend and data</w:t>
-            </w:r>
-          </w:p>
-        </w:tc>
-        <w:tc>
-          <w:tcPr>
-            <w:tcW w:w="3811" w:type="dxa"/>
-          </w:tcPr>
-          <w:p>
-            <w:pPr/>
-            <w:r>
-              <w:t xml:space="preserve">[e.g. the Pawred PostgreSQL database and APIs — fill in]</w:t>
-            </w:r>
-          </w:p>
-        </w:tc>
-        <w:tc>
-          <w:tcPr>
-            <w:tcW w:w="3360" w:type="dxa"/>
-          </w:tcPr>
-          <w:p>
-            <w:pPr/>
-            <w:r>
-              <w:t xml:space="preserve">Stores dogs, likes, matches and messages</w:t>
+              <w:t xml:space="preserve">Networking</w:t>
+            </w:r>
+          </w:p>
+        </w:tc>
+        <w:tc>
+          <w:tcPr>
+            <w:tcW w:w="3339" w:type="dxa"/>
+          </w:tcPr>
+          <w:p>
+            <w:pPr/>
+            <w:r>
+              <w:rPr>
+                <w:rStyle w:val="CodeChar"/>
+              </w:rPr>
+              <w:t xml:space="preserve">dio</w:t>
+            </w:r>
+          </w:p>
+        </w:tc>
+        <w:tc>
+          <w:tcPr>
+            <w:tcW w:w="3832" w:type="dxa"/>
+          </w:tcPr>
+          <w:p>
+            <w:pPr/>
+            <w:r>
+              <w:t xml:space="preserve">JSON requests to the Pawred backend API</w:t>
             </w:r>
           </w:p>
         </w:tc>
@@ -3257,29 +3392,117 @@
           <w:p>
             <w:pPr/>
             <w:r>
+              <w:t xml:space="preserve">Data models</w:t>
+            </w:r>
+          </w:p>
+        </w:tc>
+        <w:tc>
+          <w:tcPr>
+            <w:tcW w:w="3339" w:type="dxa"/>
+          </w:tcPr>
+          <w:p>
+            <w:pPr/>
+            <w:r>
+              <w:rPr>
+                <w:rStyle w:val="CodeChar"/>
+              </w:rPr>
+              <w:t xml:space="preserve">freezed</w:t>
+            </w:r>
+            <w:r>
+              <w:t xml:space="preserve"> + </w:t>
+            </w:r>
+            <w:r>
+              <w:rPr>
+                <w:rStyle w:val="CodeChar"/>
+              </w:rPr>
+              <w:t xml:space="preserve">json_serializable</w:t>
+            </w:r>
+          </w:p>
+        </w:tc>
+        <w:tc>
+          <w:tcPr>
+            <w:tcW w:w="3832" w:type="dxa"/>
+          </w:tcPr>
+          <w:p>
+            <w:pPr/>
+            <w:r>
+              <w:t xml:space="preserve">Immutable Dog, Photo, Prompt, Like, Match and Message classes</w:t>
+            </w:r>
+          </w:p>
+        </w:tc>
+      </w:tr>
+      <w:tr>
+        <w:tc>
+          <w:tcPr>
+            <w:tcW w:w="2189" w:type="dxa"/>
+          </w:tcPr>
+          <w:p>
+            <w:pPr/>
+            <w:r>
+              <w:t xml:space="preserve">Backend</w:t>
+            </w:r>
+          </w:p>
+        </w:tc>
+        <w:tc>
+          <w:tcPr>
+            <w:tcW w:w="3339" w:type="dxa"/>
+          </w:tcPr>
+          <w:p>
+            <w:pPr/>
+            <w:r>
+              <w:t xml:space="preserve">Pawred backend API (Next.js on Vercel), PostgreSQL via Prisma</w:t>
+            </w:r>
+          </w:p>
+        </w:tc>
+        <w:tc>
+          <w:tcPr>
+            <w:tcW w:w="3832" w:type="dxa"/>
+          </w:tcPr>
+          <w:p>
+            <w:pPr/>
+            <w:r>
+              <w:t xml:space="preserve">Same database and matching rules as the web app</w:t>
+            </w:r>
+          </w:p>
+        </w:tc>
+      </w:tr>
+      <w:tr>
+        <w:tc>
+          <w:tcPr>
+            <w:tcW w:w="2189" w:type="dxa"/>
+          </w:tcPr>
+          <w:p>
+            <w:pPr/>
+            <w:r>
               <w:t xml:space="preserve">Authentication</w:t>
             </w:r>
           </w:p>
         </w:tc>
         <w:tc>
           <w:tcPr>
-            <w:tcW w:w="3811" w:type="dxa"/>
-          </w:tcPr>
-          <w:p>
-            <w:pPr/>
-            <w:r>
-              <w:t xml:space="preserve">[fill in]</w:t>
-            </w:r>
-          </w:p>
-        </w:tc>
-        <w:tc>
-          <w:tcPr>
-            <w:tcW w:w="3360" w:type="dxa"/>
-          </w:tcPr>
-          <w:p>
-            <w:pPr/>
-            <w:r>
-              <w:t xml:space="preserve">Sign-up, sign-in and sessions</w:t>
+            <w:tcW w:w="3339" w:type="dxa"/>
+          </w:tcPr>
+          <w:p>
+            <w:pPr/>
+            <w:r>
+              <w:t xml:space="preserve">Better Auth email/password sessions; token stored with </w:t>
+            </w:r>
+            <w:r>
+              <w:rPr>
+                <w:rStyle w:val="CodeChar"/>
+              </w:rPr>
+              <w:t xml:space="preserve">flutter_secure_storage</w:t>
+            </w:r>
+          </w:p>
+        </w:tc>
+        <w:tc>
+          <w:tcPr>
+            <w:tcW w:w="3832" w:type="dxa"/>
+          </w:tcPr>
+          <w:p>
+            <w:pPr/>
+            <w:r>
+              <w:t xml:space="preserve">Sign-up, sign-in and staying signed in</w:t>
             </w:r>
           </w:p>
         </w:tc>
@@ -3292,29 +3515,50 @@
           <w:p>
             <w:pPr/>
             <w:r>
-              <w:t xml:space="preserve">Images</w:t>
-            </w:r>
-          </w:p>
-        </w:tc>
-        <w:tc>
-          <w:tcPr>
-            <w:tcW w:w="3811" w:type="dxa"/>
-          </w:tcPr>
-          <w:p>
-            <w:pPr/>
-            <w:r>
-              <w:t xml:space="preserve">[fill in, e.g. image_picker, cached_network_image]</w:t>
-            </w:r>
-          </w:p>
-        </w:tc>
-        <w:tc>
-          <w:tcPr>
-            <w:tcW w:w="3360" w:type="dxa"/>
-          </w:tcPr>
-          <w:p>
-            <w:pPr/>
-            <w:r>
-              <w:t xml:space="preserve">Uploading and showing dog photos</w:t>
+              <w:t xml:space="preserve">Photos</w:t>
+            </w:r>
+          </w:p>
+        </w:tc>
+        <w:tc>
+          <w:tcPr>
+            <w:tcW w:w="3339" w:type="dxa"/>
+          </w:tcPr>
+          <w:p>
+            <w:pPr/>
+            <w:r>
+              <w:rPr>
+                <w:rStyle w:val="CodeChar"/>
+              </w:rPr>
+              <w:t xml:space="preserve">image_picker</w:t>
+            </w:r>
+            <w:r>
+              <w:t xml:space="preserve">, </w:t>
+            </w:r>
+            <w:r>
+              <w:rPr>
+                <w:rStyle w:val="CodeChar"/>
+              </w:rPr>
+              <w:t xml:space="preserve">flutter_image_compress</w:t>
+            </w:r>
+            <w:r>
+              <w:t xml:space="preserve">, </w:t>
+            </w:r>
+            <w:r>
+              <w:rPr>
+                <w:rStyle w:val="CodeChar"/>
+              </w:rPr>
+              <w:t xml:space="preserve">cached_network_image</w:t>
+            </w:r>
+          </w:p>
+        </w:tc>
+        <w:tc>
+          <w:tcPr>
+            <w:tcW w:w="3832" w:type="dxa"/>
+          </w:tcPr>
+          <w:p>
+            <w:pPr/>
+            <w:r>
+              <w:t xml:space="preserve">Pick, shrink and upload photos; cache dog photos</w:t>
             </w:r>
           </w:p>
         </w:tc>
@@ -3327,29 +3571,108 @@
           <w:p>
             <w:pPr/>
             <w:r>
+              <w:t xml:space="preserve">Documents</w:t>
+            </w:r>
+          </w:p>
+        </w:tc>
+        <w:tc>
+          <w:tcPr>
+            <w:tcW w:w="3339" w:type="dxa"/>
+          </w:tcPr>
+          <w:p>
+            <w:pPr/>
+            <w:r>
+              <w:rPr>
+                <w:rStyle w:val="CodeChar"/>
+              </w:rPr>
+              <w:t xml:space="preserve">file_picker</w:t>
+            </w:r>
+          </w:p>
+        </w:tc>
+        <w:tc>
+          <w:tcPr>
+            <w:tcW w:w="3832" w:type="dxa"/>
+          </w:tcPr>
+          <w:p>
+            <w:pPr/>
+            <w:r>
+              <w:t xml:space="preserve">Upload vaccination cards and certificates (PDF or image)</w:t>
+            </w:r>
+          </w:p>
+        </w:tc>
+      </w:tr>
+      <w:tr>
+        <w:tc>
+          <w:tcPr>
+            <w:tcW w:w="2189" w:type="dxa"/>
+          </w:tcPr>
+          <w:p>
+            <w:pPr/>
+            <w:r>
+              <w:t xml:space="preserve">Chat updates</w:t>
+            </w:r>
+          </w:p>
+        </w:tc>
+        <w:tc>
+          <w:tcPr>
+            <w:tcW w:w="3339" w:type="dxa"/>
+          </w:tcPr>
+          <w:p>
+            <w:pPr/>
+            <w:r>
+              <w:rPr>
+                <w:rStyle w:val="CodeChar"/>
+              </w:rPr>
+              <w:t xml:space="preserve">Timer.periodic</w:t>
+            </w:r>
+            <w:r>
+              <w:t xml:space="preserve"> polling every 4 seconds</w:t>
+            </w:r>
+          </w:p>
+        </w:tc>
+        <w:tc>
+          <w:tcPr>
+            <w:tcW w:w="3832" w:type="dxa"/>
+          </w:tcPr>
+          <w:p>
+            <w:pPr/>
+            <w:r>
+              <w:t xml:space="preserve">New messages and read receipts, as on the web</w:t>
+            </w:r>
+          </w:p>
+        </w:tc>
+      </w:tr>
+      <w:tr>
+        <w:tc>
+          <w:tcPr>
+            <w:tcW w:w="2189" w:type="dxa"/>
+          </w:tcPr>
+          <w:p>
+            <w:pPr/>
+            <w:r>
               <w:t xml:space="preserve">Tools</w:t>
             </w:r>
           </w:p>
         </w:tc>
         <w:tc>
           <w:tcPr>
-            <w:tcW w:w="3811" w:type="dxa"/>
-          </w:tcPr>
-          <w:p>
-            <w:pPr/>
-            <w:r>
-              <w:t xml:space="preserve">[Android Studio / VS Code], Android emulator</w:t>
-            </w:r>
-          </w:p>
-        </w:tc>
-        <w:tc>
-          <w:tcPr>
-            <w:tcW w:w="3360" w:type="dxa"/>
-          </w:tcPr>
-          <w:p>
-            <w:pPr/>
-            <w:r>
-              <w:t xml:space="preserve">Development and testing</w:t>
+            <w:tcW w:w="3339" w:type="dxa"/>
+          </w:tcPr>
+          <w:p>
+            <w:pPr/>
+            <w:r>
+              <w:t xml:space="preserve">VS Code / Android Studio, Android emulator, Flutter DevTools</w:t>
+            </w:r>
+          </w:p>
+        </w:tc>
+        <w:tc>
+          <w:tcPr>
+            <w:tcW w:w="3832" w:type="dxa"/>
+          </w:tcPr>
+          <w:p>
+            <w:pPr/>
+            <w:r>
+              <w:t xml:space="preserve">Development, debugging and profiling</w:t>
             </w:r>
           </w:p>
         </w:tc>
@@ -3639,10 +3962,46 @@
         <w:rPr>
           <w:b/>
         </w:rPr>
-        <w:t xml:space="preserve">Development.</w:t>
-      </w:r>
-      <w:r>
-        <w:t xml:space="preserve"> Each screen is a Flutter widget tree built from reusable components (profile card, photo carousel, health chip, like button, message bubble). The bottom navigation bar keeps the four main screens one tap away, and badges show unread likes and messages.</w:t>
+        <w:t xml:space="preserve">Project structure.</w:t>
+      </w:r>
+      <w:r>
+        <w:t xml:space="preserve"> The code is organised by feature, so each screen keeps its widgets, providers and logic together:</w:t>
+      </w:r>
+    </w:p>
+    <w:p>
+      <w:pPr>
+        <w:pStyle w:val="Code"/>
+      </w:pPr>
+      <w:r>
+        <w:t xml:space="preserve">lib/</w:t>
+        <w:br/>
+        <w:t xml:space="preserve">  main.dart        app entry: ProviderScope, theme, router</w:t>
+        <w:br/>
+        <w:t xml:space="preserve">  router.dart      go_router routes and the bottom navigation shell</w:t>
+        <w:br/>
+        <w:t xml:space="preserve">  core/            dio API client, secure storage, theme, constants</w:t>
+        <w:br/>
+        <w:t xml:space="preserve">  models/          Dog, DogPhoto, PromptAnswer, HealthDoc, Like, Match, Message</w:t>
+        <w:br/>
+        <w:t xml:space="preserve">  data/            repositories: auth, dogs, discover, likes, matches, chat</w:t>
+        <w:br/>
+        <w:t xml:space="preserve">  providers/       Riverpod providers for each repository and screen</w:t>
+        <w:br/>
+        <w:t xml:space="preserve">  features/</w:t>
+        <w:br/>
+        <w:t xml:space="preserve">    auth/          welcome, sign in, sign up</w:t>
+        <w:br/>
+        <w:t xml:space="preserve">    onboarding/    4-step stepper: basics, photos, prompts, health</w:t>
+        <w:br/>
+        <w:t xml:space="preserve">    discover/      feed, grid, filters, fit notes</w:t>
+        <w:br/>
+        <w:t xml:space="preserve">    profile/       dog profile, edit profile, settings</w:t>
+        <w:br/>
+        <w:t xml:space="preserve">    likes/         likes you, like back / not for us</w:t>
+        <w:br/>
+        <w:t xml:space="preserve">    matches/       matches list, chat</w:t>
+        <w:br/>
+        <w:t xml:space="preserve">  widgets/         PhotoCarousel, HealthChip, LikeButton, MessageBubble</w:t>
       </w:r>
     </w:p>
     <w:p>
@@ -3651,54 +4010,136 @@
         <w:rPr>
           <w:b/>
         </w:rPr>
-        <w:t xml:space="preserve">Deployment.</w:t>
-      </w:r>
-      <w:r>
-        <w:t xml:space="preserve"> The Android app is built with </w:t>
+        <w:t xml:space="preserve">Development.</w:t>
+      </w:r>
+      <w:r>
+        <w:t xml:space="preserve"> The app has four layers (Fig. 3.1). Each screen is a </w:t>
       </w:r>
       <w:r>
         <w:rPr>
           <w:rStyle w:val="CodeChar"/>
         </w:rPr>
-        <w:t xml:space="preserve">flutter build apk --release</w:t>
-      </w:r>
-      <w:r>
-        <w:t xml:space="preserve"> and installed on test phones. An iOS build needs a Mac with Xcode (</w:t>
+        <w:t xml:space="preserve">ConsumerWidget</w:t>
+      </w:r>
+      <w:r>
+        <w:t xml:space="preserve"> that watches a Riverpod provider. Providers call repositories, and repositories call the backend through one </w:t>
       </w:r>
       <w:r>
         <w:rPr>
           <w:rStyle w:val="CodeChar"/>
         </w:rPr>
-        <w:t xml:space="preserve">flutter build ios</w:t>
-      </w:r>
-      <w:r>
-        <w:t xml:space="preserve">). [State which platforms you built and tested on.]</w:t>
-      </w:r>
-    </w:p>
-    <w:p>
-      <w:pPr>
-        <w:pStyle w:val="Heading2"/>
-      </w:pPr>
-      <w:r>
-        <w:t xml:space="preserve">Chapter 4 — Result Analysis</w:t>
-      </w:r>
-    </w:p>
-    <w:p>
-      <w:pPr/>
-      <w:r>
-        <w:t xml:space="preserve">The app covers the full owner journey on a phone: sign up, create a dog profile, discover compatible dogs, like, match and chat. Figures 4.1 to 4.4 show the screen designs the Flutter app follows.</w:t>
-      </w:r>
-    </w:p>
-    <w:p>
-      <w:pPr/>
+        <w:t xml:space="preserve">dio</w:t>
+      </w:r>
+      <w:r>
+        <w:t xml:space="preserve"> client that adds the session token to every request. JSON responses are parsed into </w:t>
+      </w:r>
+      <w:r>
+        <w:rPr>
+          <w:rStyle w:val="CodeChar"/>
+        </w:rPr>
+        <w:t xml:space="preserve">freezed</w:t>
+      </w:r>
+      <w:r>
+        <w:t xml:space="preserve"> model classes, so screens never handle raw maps.</w:t>
+      </w:r>
+    </w:p>
+    <w:p>
+      <w:pPr>
+        <w:pStyle w:val="ListParagraph"/>
+        <w:numPr>
+          <w:ilvl w:val="0"/>
+          <w:numId w:val="5"/>
+        </w:numPr>
+      </w:pPr>
       <w:r>
         <w:rPr>
           <w:b/>
         </w:rPr>
-        <w:t xml:space="preserve">Note on the figures:</w:t>
-      </w:r>
-      <w:r>
-        <w:t xml:space="preserve"> these are reference UI designs taken from the mobile view of the Pawred web application and placed in a phone frame. They show the layout and flow the Flutter screens implement. They are not screenshots of the Flutter build. All names, dogs and messages are made-up sample data.</w:t>
+        <w:t xml:space="preserve">Onboarding</w:t>
+      </w:r>
+      <w:r>
+        <w:t xml:space="preserve"> is a four-step </w:t>
+      </w:r>
+      <w:r>
+        <w:rPr>
+          <w:rStyle w:val="CodeChar"/>
+        </w:rPr>
+        <w:t xml:space="preserve">Stepper</w:t>
+      </w:r>
+      <w:r>
+        <w:t xml:space="preserve"> with form validation that mirrors the web rules: name and breed required, date of birth at least 18 months ago, three prompt answers, and photos compressed on the phone before upload.</w:t>
+      </w:r>
+    </w:p>
+    <w:p>
+      <w:pPr>
+        <w:pStyle w:val="ListParagraph"/>
+        <w:numPr>
+          <w:ilvl w:val="0"/>
+          <w:numId w:val="5"/>
+        </w:numPr>
+      </w:pPr>
+      <w:r>
+        <w:rPr>
+          <w:b/>
+        </w:rPr>
+        <w:t xml:space="preserve">Discover</w:t>
+      </w:r>
+      <w:r>
+        <w:t xml:space="preserve"> asks the backend for compatible dogs, which are already filtered and ranked admirers-first. The feed is a </w:t>
+      </w:r>
+      <w:r>
+        <w:rPr>
+          <w:rStyle w:val="CodeChar"/>
+        </w:rPr>
+        <w:t xml:space="preserve">ListView</w:t>
+      </w:r>
+      <w:r>
+        <w:t xml:space="preserve"> of profile cards with a swipeable </w:t>
+      </w:r>
+      <w:r>
+        <w:rPr>
+          <w:rStyle w:val="CodeChar"/>
+        </w:rPr>
+        <w:t xml:space="preserve">PhotoCarousel</w:t>
+      </w:r>
+      <w:r>
+        <w:t xml:space="preserve">; the grid is a two-column masonry view. Filter chips (Verified only, same city) refresh the provider.</w:t>
+      </w:r>
+    </w:p>
+    <w:p>
+      <w:pPr>
+        <w:pStyle w:val="ListParagraph"/>
+        <w:numPr>
+          <w:ilvl w:val="0"/>
+          <w:numId w:val="5"/>
+        </w:numPr>
+      </w:pPr>
+      <w:r>
+        <w:rPr>
+          <w:b/>
+        </w:rPr>
+        <w:t xml:space="preserve">Liking</w:t>
+      </w:r>
+      <w:r>
+        <w:t xml:space="preserve"> a photo (double-tap) or a prompt (heart button) opens a bottom sheet for an optional comment. If the other dog has already liked back, the API returns a match and the app shows the match screen.</w:t>
+      </w:r>
+    </w:p>
+    <w:p>
+      <w:pPr>
+        <w:pStyle w:val="ListParagraph"/>
+        <w:numPr>
+          <w:ilvl w:val="0"/>
+          <w:numId w:val="5"/>
+        </w:numPr>
+      </w:pPr>
+      <w:r>
+        <w:rPr>
+          <w:b/>
+        </w:rPr>
+        <w:t xml:space="preserve">Chat</w:t>
+      </w:r>
+      <w:r>
+        <w:t xml:space="preserve"> loads the latest messages, then polls every 4 seconds for new ones and marks them read. Unread counts feed the badges on the bottom navigation bar.</w:t>
       </w:r>
     </w:p>
     <w:p>
@@ -3706,13 +4147,13 @@
       <w:r>
         <w:drawing>
           <wp:inline distT="0" distB="0" distL="0" distR="0">
-            <wp:extent cx="5486400" cy="3950208"/>
-            <wp:docPr id="1" name="image1" descr="Fig. 4.1 — Welcome, sign-in and sign-up screen designs"/>
+            <wp:extent cx="5486400" cy="2914650"/>
+            <wp:docPr id="1" name="image1" descr="Fig. 3.1 — Architecture of the Flutter app"/>
             <a:graphic xmlns:a="http://schemas.openxmlformats.org/drawingml/2006/main">
               <a:graphicData uri="http://schemas.openxmlformats.org/drawingml/2006/picture">
                 <pic:pic xmlns:pic="http://schemas.openxmlformats.org/drawingml/2006/picture">
                   <pic:nvPicPr>
-                    <pic:cNvPr id="1" name="image1" descr="Fig. 4.1 — Welcome, sign-in and sign-up screen designs"/>
+                    <pic:cNvPr id="1" name="image1" descr="Fig. 3.1 — Architecture of the Flutter app"/>
                     <pic:cNvPicPr/>
                   </pic:nvPicPr>
                   <pic:blipFill>
@@ -3724,7 +4165,7 @@
                   <pic:spPr>
                     <a:xfrm>
                       <a:off x="0" y="0"/>
-                      <a:ext cx="5486400" cy="3950208"/>
+                      <a:ext cx="5486400" cy="2914650"/>
                     </a:xfrm>
                     <a:prstGeom prst="rect">
                       <a:avLst/>
@@ -3740,10 +4181,87 @@
     <w:p>
       <w:pPr/>
       <w:r>
+        <w:t xml:space="preserve">Fig. 3.1 — Architecture of the Flutter app</w:t>
+      </w:r>
+    </w:p>
+    <w:p>
+      <w:pPr/>
+      <w:r>
+        <w:t xml:space="preserve">The web app and the Flutter app share the backend, database and file storage; only the screens differ.</w:t>
+      </w:r>
+    </w:p>
+    <w:p>
+      <w:pPr/>
+      <w:r>
         <w:rPr>
-          <w:i/>
+          <w:b/>
         </w:rPr>
-        <w:t xml:space="preserve">Fig. 4.1 — Reference UI design: welcome, sign-in and sign-up screens</w:t>
+        <w:t xml:space="preserve">Deployment.</w:t>
+      </w:r>
+      <w:r>
+        <w:t xml:space="preserve"> Debug builds run on the Android emulator and on an Android phone connected over USB, with hot reload during development. The backend address is passed at build time with </w:t>
+      </w:r>
+      <w:r>
+        <w:rPr>
+          <w:rStyle w:val="CodeChar"/>
+        </w:rPr>
+        <w:t xml:space="preserve">--dart-define=API_URL=…</w:t>
+      </w:r>
+      <w:r>
+        <w:t xml:space="preserve">, so the same code can point at a local server or the deployed one. The release app is built with </w:t>
+      </w:r>
+      <w:r>
+        <w:rPr>
+          <w:rStyle w:val="CodeChar"/>
+        </w:rPr>
+        <w:t xml:space="preserve">flutter build apk --release</w:t>
+      </w:r>
+      <w:r>
+        <w:t xml:space="preserve">, or </w:t>
+      </w:r>
+      <w:r>
+        <w:rPr>
+          <w:rStyle w:val="CodeChar"/>
+        </w:rPr>
+        <w:t xml:space="preserve">flutter build appbundle</w:t>
+      </w:r>
+      <w:r>
+        <w:t xml:space="preserve"> for the Google Play Store. An iOS build needs a Mac with Xcode (</w:t>
+      </w:r>
+      <w:r>
+        <w:rPr>
+          <w:rStyle w:val="CodeChar"/>
+        </w:rPr>
+        <w:t xml:space="preserve">flutter build ios</w:t>
+      </w:r>
+      <w:r>
+        <w:t xml:space="preserve">).</w:t>
+      </w:r>
+    </w:p>
+    <w:p>
+      <w:pPr>
+        <w:pStyle w:val="Heading2"/>
+      </w:pPr>
+      <w:r>
+        <w:t xml:space="preserve">Chapter 4 — Result Analysis</w:t>
+      </w:r>
+    </w:p>
+    <w:p>
+      <w:pPr/>
+      <w:r>
+        <w:t xml:space="preserve">The app covers the full owner journey on a phone: sign up, create a dog profile, discover compatible dogs, like, match and chat. Figures 4.1 to 4.4 show the screen designs the Flutter app follows.</w:t>
+      </w:r>
+    </w:p>
+    <w:p>
+      <w:pPr/>
+      <w:r>
+        <w:rPr>
+          <w:b/>
+        </w:rPr>
+        <w:t xml:space="preserve">Note on the figures:</w:t>
+      </w:r>
+      <w:r>
+        <w:t xml:space="preserve"> these are reference UI designs taken from the mobile view of the Pawred web application and placed in a phone frame. They show the layout and flow the Flutter screens implement. They are not screenshots of the Flutter build. All names, dogs and messages are made-up sample data.</w:t>
       </w:r>
     </w:p>
     <w:p>
@@ -3752,12 +4270,12 @@
         <w:drawing>
           <wp:inline distT="0" distB="0" distL="0" distR="0">
             <wp:extent cx="5486400" cy="3950208"/>
-            <wp:docPr id="2" name="image2" descr="Fig. 4.2 — Onboarding and Discover screen designs"/>
+            <wp:docPr id="2" name="image2" descr="Fig. 4.1 — Welcome, sign-in and sign-up screen designs"/>
             <a:graphic xmlns:a="http://schemas.openxmlformats.org/drawingml/2006/main">
               <a:graphicData uri="http://schemas.openxmlformats.org/drawingml/2006/picture">
                 <pic:pic xmlns:pic="http://schemas.openxmlformats.org/drawingml/2006/picture">
                   <pic:nvPicPr>
-                    <pic:cNvPr id="2" name="image2" descr="Fig. 4.2 — Onboarding and Discover screen designs"/>
+                    <pic:cNvPr id="2" name="image2" descr="Fig. 4.1 — Welcome, sign-in and sign-up screen designs"/>
                     <pic:cNvPicPr/>
                   </pic:nvPicPr>
                   <pic:blipFill>
@@ -3788,7 +4306,7 @@
         <w:rPr>
           <w:i/>
         </w:rPr>
-        <w:t xml:space="preserve">Fig. 4.2 — Reference UI design: onboarding step 1, Discover feed and Discover grid</w:t>
+        <w:t xml:space="preserve">Fig. 4.1 — Reference UI design: welcome, sign-in and sign-up screens</w:t>
       </w:r>
     </w:p>
     <w:p>
@@ -3797,12 +4315,12 @@
         <w:drawing>
           <wp:inline distT="0" distB="0" distL="0" distR="0">
             <wp:extent cx="5486400" cy="3950208"/>
-            <wp:docPr id="3" name="image3" descr="Fig. 4.3 — Dog profile, Likes you and Matches screen designs"/>
+            <wp:docPr id="3" name="image3" descr="Fig. 4.2 — Onboarding and Discover screen designs"/>
             <a:graphic xmlns:a="http://schemas.openxmlformats.org/drawingml/2006/main">
               <a:graphicData uri="http://schemas.openxmlformats.org/drawingml/2006/picture">
                 <pic:pic xmlns:pic="http://schemas.openxmlformats.org/drawingml/2006/picture">
                   <pic:nvPicPr>
-                    <pic:cNvPr id="3" name="image3" descr="Fig. 4.3 — Dog profile, Likes you and Matches screen designs"/>
+                    <pic:cNvPr id="3" name="image3" descr="Fig. 4.2 — Onboarding and Discover screen designs"/>
                     <pic:cNvPicPr/>
                   </pic:nvPicPr>
                   <pic:blipFill>
@@ -3833,7 +4351,7 @@
         <w:rPr>
           <w:i/>
         </w:rPr>
-        <w:t xml:space="preserve">Fig. 4.3 — Reference UI design: dog profile with fit notes, Likes you, and Matches</w:t>
+        <w:t xml:space="preserve">Fig. 4.2 — Reference UI design: onboarding step 1, Discover feed and Discover grid</w:t>
       </w:r>
     </w:p>
     <w:p>
@@ -3842,12 +4360,12 @@
         <w:drawing>
           <wp:inline distT="0" distB="0" distL="0" distR="0">
             <wp:extent cx="5486400" cy="3950208"/>
-            <wp:docPr id="4" name="image4" descr="Fig. 4.4 — Chat, edit profile and settings screen designs"/>
+            <wp:docPr id="4" name="image4" descr="Fig. 4.3 — Dog profile, Likes you and Matches screen designs"/>
             <a:graphic xmlns:a="http://schemas.openxmlformats.org/drawingml/2006/main">
               <a:graphicData uri="http://schemas.openxmlformats.org/drawingml/2006/picture">
                 <pic:pic xmlns:pic="http://schemas.openxmlformats.org/drawingml/2006/picture">
                   <pic:nvPicPr>
-                    <pic:cNvPr id="4" name="image4" descr="Fig. 4.4 — Chat, edit profile and settings screen designs"/>
+                    <pic:cNvPr id="4" name="image4" descr="Fig. 4.3 — Dog profile, Likes you and Matches screen designs"/>
                     <pic:cNvPicPr/>
                   </pic:nvPicPr>
                   <pic:blipFill>
@@ -3878,6 +4396,51 @@
         <w:rPr>
           <w:i/>
         </w:rPr>
+        <w:t xml:space="preserve">Fig. 4.3 — Reference UI design: dog profile with fit notes, Likes you, and Matches</w:t>
+      </w:r>
+    </w:p>
+    <w:p>
+      <w:pPr/>
+      <w:r>
+        <w:drawing>
+          <wp:inline distT="0" distB="0" distL="0" distR="0">
+            <wp:extent cx="5486400" cy="3950208"/>
+            <wp:docPr id="5" name="image5" descr="Fig. 4.4 — Chat, edit profile and settings screen designs"/>
+            <a:graphic xmlns:a="http://schemas.openxmlformats.org/drawingml/2006/main">
+              <a:graphicData uri="http://schemas.openxmlformats.org/drawingml/2006/picture">
+                <pic:pic xmlns:pic="http://schemas.openxmlformats.org/drawingml/2006/picture">
+                  <pic:nvPicPr>
+                    <pic:cNvPr id="5" name="image5" descr="Fig. 4.4 — Chat, edit profile and settings screen designs"/>
+                    <pic:cNvPicPr/>
+                  </pic:nvPicPr>
+                  <pic:blipFill>
+                    <a:blip r:embed="rId7"/>
+                    <a:stretch>
+                      <a:fillRect/>
+                    </a:stretch>
+                  </pic:blipFill>
+                  <pic:spPr>
+                    <a:xfrm>
+                      <a:off x="0" y="0"/>
+                      <a:ext cx="5486400" cy="3950208"/>
+                    </a:xfrm>
+                    <a:prstGeom prst="rect">
+                      <a:avLst/>
+                    </a:prstGeom>
+                  </pic:spPr>
+                </pic:pic>
+              </a:graphicData>
+            </a:graphic>
+          </wp:inline>
+        </w:drawing>
+      </w:r>
+    </w:p>
+    <w:p>
+      <w:pPr/>
+      <w:r>
+        <w:rPr>
+          <w:i/>
+        </w:rPr>
         <w:t xml:space="preserve">Fig. 4.4 — Reference UI design: chat with read receipts, edit profile, and settings</w:t>
       </w:r>
     </w:p>
@@ -4449,173 +5012,343 @@
         <w:t xml:space="preserve">App performance.</w:t>
       </w:r>
       <w:r>
-        <w:t xml:space="preserve"> [Fill in measured values from Flutter DevTools or the phone: release APK size, cold-start time, and frame rate while scrolling Discover.]</w:t>
-      </w:r>
-    </w:p>
-    <w:p>
-      <w:pPr>
-        <w:pStyle w:val="Heading2"/>
-      </w:pPr>
-      <w:r>
-        <w:t xml:space="preserve">Chapter 5 — Conclusion</w:t>
+        <w:t xml:space="preserve"> Table 4.2 sets the performance targets for the release build. Measure each one with Flutter DevTools on a mid-range Android phone and record the result.</w:t>
       </w:r>
     </w:p>
     <w:p>
       <w:pPr/>
-      <w:r>
-        <w:t xml:space="preserve">Pawred Mobile brings a health-first, explainable dog matchmaking system to Android and iOS from one Flutter codebase. It recommends only compatible dogs, shows likely matches first, explains why each dog fits, and keeps health information on every profile. Specific likes, mutual matching and in-app chat replace the guesswork of classifieds and WhatsApp groups, and the design stays consistent with the Pawred web app.</w:t>
-      </w:r>
-    </w:p>
-    <w:p>
-      <w:pPr>
-        <w:pStyle w:val="Heading3"/>
-      </w:pPr>
-      <w:r>
-        <w:t xml:space="preserve">5.1 Future Enhancements</w:t>
-      </w:r>
-    </w:p>
-    <w:p>
-      <w:pPr>
-        <w:pStyle w:val="ListParagraph"/>
-        <w:numPr>
-          <w:ilvl w:val="0"/>
-          <w:numId w:val="5"/>
-        </w:numPr>
-      </w:pPr>
       <w:r>
         <w:rPr>
           <w:b/>
         </w:rPr>
-        <w:t xml:space="preserve">Push notifications</w:t>
-      </w:r>
-      <w:r>
-        <w:t xml:space="preserve"> for new likes, matches and messages (for example with Firebase Cloud Messaging).</w:t>
-      </w:r>
-    </w:p>
-    <w:p>
-      <w:pPr>
-        <w:pStyle w:val="ListParagraph"/>
-        <w:numPr>
-          <w:ilvl w:val="0"/>
-          <w:numId w:val="5"/>
-        </w:numPr>
-      </w:pPr>
+        <w:t xml:space="preserve">Table 4.2 — Performance targets</w:t>
+      </w:r>
+    </w:p>
+    <w:tbl>
+      <w:tblPr>
+        <w:tblStyle w:val="TableGrid"/>
+        <w:tblW w:w="0" w:type="auto"/>
+        <w:tblLayout w:type="fixed"/>
+        <w:tblLook w:val="04A0" w:firstRow="1" w:lastRow="0" w:firstColumn="0" w:lastColumn="0" w:noHBand="0" w:noVBand="1"/>
+      </w:tblPr>
+      <w:tblGrid>
+        <w:gridCol w:w="1589"/>
+        <w:gridCol w:w="4803"/>
+        <w:gridCol w:w="1695"/>
+        <w:gridCol w:w="1273"/>
+      </w:tblGrid>
+      <w:tr>
+        <w:trPr>
+          <w:tblHeader/>
+        </w:trPr>
+        <w:tc>
+          <w:tcPr>
+            <w:tcW w:w="1589" w:type="dxa"/>
+            <w:shd w:val="clear" w:color="auto" w:fill="F2F2F2"/>
+          </w:tcPr>
+          <w:p>
+            <w:pPr/>
+            <w:r>
+              <w:t xml:space="preserve">Measure</w:t>
+            </w:r>
+          </w:p>
+        </w:tc>
+        <w:tc>
+          <w:tcPr>
+            <w:tcW w:w="4803" w:type="dxa"/>
+            <w:shd w:val="clear" w:color="auto" w:fill="F2F2F2"/>
+          </w:tcPr>
+          <w:p>
+            <w:pPr/>
+            <w:r>
+              <w:t xml:space="preserve">How it is measured</w:t>
+            </w:r>
+          </w:p>
+        </w:tc>
+        <w:tc>
+          <w:tcPr>
+            <w:tcW w:w="1695" w:type="dxa"/>
+            <w:shd w:val="clear" w:color="auto" w:fill="F2F2F2"/>
+          </w:tcPr>
+          <w:p>
+            <w:pPr/>
+            <w:r>
+              <w:t xml:space="preserve">Target</w:t>
+            </w:r>
+          </w:p>
+        </w:tc>
+        <w:tc>
+          <w:tcPr>
+            <w:tcW w:w="1273" w:type="dxa"/>
+            <w:shd w:val="clear" w:color="auto" w:fill="F2F2F2"/>
+          </w:tcPr>
+          <w:p>
+            <w:pPr/>
+            <w:r>
+              <w:t xml:space="preserve">Result</w:t>
+            </w:r>
+          </w:p>
+        </w:tc>
+      </w:tr>
+      <w:tr>
+        <w:tc>
+          <w:tcPr>
+            <w:tcW w:w="1589" w:type="dxa"/>
+          </w:tcPr>
+          <w:p>
+            <w:pPr/>
+            <w:r>
+              <w:t xml:space="preserve">Release APK size</w:t>
+            </w:r>
+          </w:p>
+        </w:tc>
+        <w:tc>
+          <w:tcPr>
+            <w:tcW w:w="4803" w:type="dxa"/>
+          </w:tcPr>
+          <w:p>
+            <w:pPr/>
+            <w:r>
+              <w:t xml:space="preserve">Size of the file from </w:t>
+            </w:r>
+            <w:r>
+              <w:rPr>
+                <w:rStyle w:val="CodeChar"/>
+              </w:rPr>
+              <w:t xml:space="preserve">flutter build apk --release --split-per-abi</w:t>
+            </w:r>
+          </w:p>
+        </w:tc>
+        <w:tc>
+          <w:tcPr>
+            <w:tcW w:w="1695" w:type="dxa"/>
+          </w:tcPr>
+          <w:p>
+            <w:pPr/>
+            <w:r>
+              <w:t xml:space="preserve">Under 25 MB</w:t>
+            </w:r>
+          </w:p>
+        </w:tc>
+        <w:tc>
+          <w:tcPr>
+            <w:tcW w:w="1273" w:type="dxa"/>
+          </w:tcPr>
+          <w:p>
+            <w:pPr/>
+            <w:r>
+              <w:t xml:space="preserve">[measure]</w:t>
+            </w:r>
+          </w:p>
+        </w:tc>
+      </w:tr>
+      <w:tr>
+        <w:tc>
+          <w:tcPr>
+            <w:tcW w:w="1589" w:type="dxa"/>
+          </w:tcPr>
+          <w:p>
+            <w:pPr/>
+            <w:r>
+              <w:t xml:space="preserve">Cold start time</w:t>
+            </w:r>
+          </w:p>
+        </w:tc>
+        <w:tc>
+          <w:tcPr>
+            <w:tcW w:w="4803" w:type="dxa"/>
+          </w:tcPr>
+          <w:p>
+            <w:pPr/>
+            <w:r>
+              <w:t xml:space="preserve">App launch to first Discover frame (DevTools timeline)</w:t>
+            </w:r>
+          </w:p>
+        </w:tc>
+        <w:tc>
+          <w:tcPr>
+            <w:tcW w:w="1695" w:type="dxa"/>
+          </w:tcPr>
+          <w:p>
+            <w:pPr/>
+            <w:r>
+              <w:t xml:space="preserve">Under 2 seconds</w:t>
+            </w:r>
+          </w:p>
+        </w:tc>
+        <w:tc>
+          <w:tcPr>
+            <w:tcW w:w="1273" w:type="dxa"/>
+          </w:tcPr>
+          <w:p>
+            <w:pPr/>
+            <w:r>
+              <w:t xml:space="preserve">[measure]</w:t>
+            </w:r>
+          </w:p>
+        </w:tc>
+      </w:tr>
+      <w:tr>
+        <w:tc>
+          <w:tcPr>
+            <w:tcW w:w="1589" w:type="dxa"/>
+          </w:tcPr>
+          <w:p>
+            <w:pPr/>
+            <w:r>
+              <w:t xml:space="preserve">Scrolling smoothness</w:t>
+            </w:r>
+          </w:p>
+        </w:tc>
+        <w:tc>
+          <w:tcPr>
+            <w:tcW w:w="4803" w:type="dxa"/>
+          </w:tcPr>
+          <w:p>
+            <w:pPr/>
+            <w:r>
+              <w:t xml:space="preserve">Frame rate while scrolling the Discover feed (DevTools performance view)</w:t>
+            </w:r>
+          </w:p>
+        </w:tc>
+        <w:tc>
+          <w:tcPr>
+            <w:tcW w:w="1695" w:type="dxa"/>
+          </w:tcPr>
+          <w:p>
+            <w:pPr/>
+            <w:r>
+              <w:t xml:space="preserve">60 fps, no janky frames</w:t>
+            </w:r>
+          </w:p>
+        </w:tc>
+        <w:tc>
+          <w:tcPr>
+            <w:tcW w:w="1273" w:type="dxa"/>
+          </w:tcPr>
+          <w:p>
+            <w:pPr/>
+            <w:r>
+              <w:t xml:space="preserve">[measure]</w:t>
+            </w:r>
+          </w:p>
+        </w:tc>
+      </w:tr>
+      <w:tr>
+        <w:tc>
+          <w:tcPr>
+            <w:tcW w:w="1589" w:type="dxa"/>
+          </w:tcPr>
+          <w:p>
+            <w:pPr/>
+            <w:r>
+              <w:t xml:space="preserve">Photo upload</w:t>
+            </w:r>
+          </w:p>
+        </w:tc>
+        <w:tc>
+          <w:tcPr>
+            <w:tcW w:w="4803" w:type="dxa"/>
+          </w:tcPr>
+          <w:p>
+            <w:pPr/>
+            <w:r>
+              <w:t xml:space="preserve">Time to compress and upload one photo on 4G</w:t>
+            </w:r>
+          </w:p>
+        </w:tc>
+        <w:tc>
+          <w:tcPr>
+            <w:tcW w:w="1695" w:type="dxa"/>
+          </w:tcPr>
+          <w:p>
+            <w:pPr/>
+            <w:r>
+              <w:t xml:space="preserve">Under 3 seconds</w:t>
+            </w:r>
+          </w:p>
+        </w:tc>
+        <w:tc>
+          <w:tcPr>
+            <w:tcW w:w="1273" w:type="dxa"/>
+          </w:tcPr>
+          <w:p>
+            <w:pPr/>
+            <w:r>
+              <w:t xml:space="preserve">[measure]</w:t>
+            </w:r>
+          </w:p>
+        </w:tc>
+      </w:tr>
+      <w:tr>
+        <w:tc>
+          <w:tcPr>
+            <w:tcW w:w="1589" w:type="dxa"/>
+          </w:tcPr>
+          <w:p>
+            <w:pPr/>
+            <w:r>
+              <w:t xml:space="preserve">New chat message</w:t>
+            </w:r>
+          </w:p>
+        </w:tc>
+        <w:tc>
+          <w:tcPr>
+            <w:tcW w:w="4803" w:type="dxa"/>
+          </w:tcPr>
+          <w:p>
+            <w:pPr/>
+            <w:r>
+              <w:t xml:space="preserve">Time for a sent message to appear on the other phone</w:t>
+            </w:r>
+          </w:p>
+        </w:tc>
+        <w:tc>
+          <w:tcPr>
+            <w:tcW w:w="1695" w:type="dxa"/>
+          </w:tcPr>
+          <w:p>
+            <w:pPr/>
+            <w:r>
+              <w:t xml:space="preserve">Within 4 seconds (one poll)</w:t>
+            </w:r>
+          </w:p>
+        </w:tc>
+        <w:tc>
+          <w:tcPr>
+            <w:tcW w:w="1273" w:type="dxa"/>
+          </w:tcPr>
+          <w:p>
+            <w:pPr/>
+            <w:r>
+              <w:t xml:space="preserve">[measure]</w:t>
+            </w:r>
+          </w:p>
+        </w:tc>
+      </w:tr>
+    </w:tbl>
+    <w:p>
+      <w:pPr/>
+      <w:r>
+        <w:t xml:space="preserve">The main techniques that keep the app fast are cached network images, photos compressed before upload, lazily built lists (</w:t>
+      </w:r>
       <w:r>
         <w:rPr>
-          <w:b/>
+          <w:rStyle w:val="CodeChar"/>
         </w:rPr>
-        <w:t xml:space="preserve">Real-time chat</w:t>
-      </w:r>
-      <w:r>
-        <w:t xml:space="preserve"> using WebSockets instead of refreshing for new messages.</w:t>
-      </w:r>
-    </w:p>
-    <w:p>
-      <w:pPr>
-        <w:pStyle w:val="ListParagraph"/>
-        <w:numPr>
-          <w:ilvl w:val="0"/>
-          <w:numId w:val="5"/>
-        </w:numPr>
-      </w:pPr>
+        <w:t xml:space="preserve">ListView.builder</w:t>
+      </w:r>
+      <w:r>
+        <w:t xml:space="preserve">), and </w:t>
+      </w:r>
       <w:r>
         <w:rPr>
-          <w:b/>
+          <w:rStyle w:val="CodeChar"/>
         </w:rPr>
-        <w:t xml:space="preserve">Location-based search</w:t>
-      </w:r>
-      <w:r>
-        <w:t xml:space="preserve"> using the phone's GPS to sort dogs by distance.</w:t>
-      </w:r>
-    </w:p>
-    <w:p>
-      <w:pPr>
-        <w:pStyle w:val="ListParagraph"/>
-        <w:numPr>
-          <w:ilvl w:val="0"/>
-          <w:numId w:val="5"/>
-        </w:numPr>
-      </w:pPr>
-      <w:r>
-        <w:rPr>
-          <w:b/>
-        </w:rPr>
-        <w:t xml:space="preserve">Document scanning</w:t>
-      </w:r>
-      <w:r>
-        <w:t xml:space="preserve"> with the camera and OCR to read vaccination dates.</w:t>
-      </w:r>
-    </w:p>
-    <w:p>
-      <w:pPr>
-        <w:pStyle w:val="ListParagraph"/>
-        <w:numPr>
-          <w:ilvl w:val="0"/>
-          <w:numId w:val="5"/>
-        </w:numPr>
-      </w:pPr>
-      <w:r>
-        <w:rPr>
-          <w:b/>
-        </w:rPr>
-        <w:t xml:space="preserve">Offline mode</w:t>
-      </w:r>
-      <w:r>
-        <w:t xml:space="preserve"> that caches profiles and chats for weak network areas.</w:t>
-      </w:r>
-    </w:p>
-    <w:p>
-      <w:pPr>
-        <w:pStyle w:val="ListParagraph"/>
-        <w:numPr>
-          <w:ilvl w:val="0"/>
-          <w:numId w:val="5"/>
-        </w:numPr>
-      </w:pPr>
-      <w:r>
-        <w:rPr>
-          <w:b/>
-        </w:rPr>
-        <w:t xml:space="preserve">Learned ranking</w:t>
-      </w:r>
-      <w:r>
-        <w:t xml:space="preserve"> using collaborative filtering once enough likes and matches exist.</w:t>
-      </w:r>
-    </w:p>
-    <w:p>
-      <w:pPr>
-        <w:pStyle w:val="ListParagraph"/>
-        <w:numPr>
-          <w:ilvl w:val="0"/>
-          <w:numId w:val="5"/>
-        </w:numPr>
-      </w:pPr>
-      <w:r>
-        <w:rPr>
-          <w:b/>
-        </w:rPr>
-        <w:t xml:space="preserve">Regional language support</w:t>
-      </w:r>
-      <w:r>
-        <w:t xml:space="preserve"> for owners across India.</w:t>
-      </w:r>
-    </w:p>
-    <w:p>
-      <w:pPr>
-        <w:pStyle w:val="ListParagraph"/>
-        <w:numPr>
-          <w:ilvl w:val="0"/>
-          <w:numId w:val="5"/>
-        </w:numPr>
-      </w:pPr>
-      <w:r>
-        <w:rPr>
-          <w:b/>
-        </w:rPr>
-        <w:t xml:space="preserve">Publishing</w:t>
-      </w:r>
-      <w:r>
-        <w:t xml:space="preserve"> on the Google Play Store and Apple App Store.</w:t>
+        <w:t xml:space="preserve">const</w:t>
+      </w:r>
+      <w:r>
+        <w:t xml:space="preserve"> widgets where the content does not change.</w:t>
       </w:r>
     </w:p>
     <w:p>
@@ -4623,10 +5356,21 @@
         <w:pStyle w:val="Heading2"/>
       </w:pPr>
       <w:r>
-        <w:rPr>
-          <w:i/>
-        </w:rPr>
-        <w:t xml:space="preserve">References</w:t>
+        <w:t xml:space="preserve">Chapter 5 — Conclusion</w:t>
+      </w:r>
+    </w:p>
+    <w:p>
+      <w:pPr/>
+      <w:r>
+        <w:t xml:space="preserve">Pawred Mobile brings a health-first, explainable dog matchmaking system to Android and iOS from one Flutter codebase. It recommends only compatible dogs, shows likely matches first, explains why each dog fits, and keeps health information on every profile. Specific likes, mutual matching and in-app chat replace the guesswork of classifieds and WhatsApp groups, and the design stays consistent with the Pawred web app.</w:t>
+      </w:r>
+    </w:p>
+    <w:p>
+      <w:pPr>
+        <w:pStyle w:val="Heading3"/>
+      </w:pPr>
+      <w:r>
+        <w:t xml:space="preserve">5.1 Future Enhancements</w:t>
       </w:r>
     </w:p>
     <w:p>
@@ -4638,16 +5382,13 @@
         </w:numPr>
       </w:pPr>
       <w:r>
-        <w:t xml:space="preserve">F. Ricci, L. Rokach and B. Shapira, </w:t>
-      </w:r>
-      <w:r>
         <w:rPr>
-          <w:i/>
+          <w:b/>
         </w:rPr>
-        <w:t xml:space="preserve">Recommender Systems Handbook</w:t>
-      </w:r>
-      <w:r>
-        <w:t xml:space="preserve">, 3rd ed., Springer, 2022.</w:t>
+        <w:t xml:space="preserve">Push notifications</w:t>
+      </w:r>
+      <w:r>
+        <w:t xml:space="preserve"> for new likes, matches and messages (for example with Firebase Cloud Messaging).</w:t>
       </w:r>
     </w:p>
     <w:p>
@@ -4659,16 +5400,13 @@
         </w:numPr>
       </w:pPr>
       <w:r>
-        <w:t xml:space="preserve">G. Linden, B. Smith and J. York, “Amazon.com recommendations: Item-to-item collaborative filtering,” </w:t>
-      </w:r>
-      <w:r>
         <w:rPr>
-          <w:i/>
+          <w:b/>
         </w:rPr>
-        <w:t xml:space="preserve">IEEE Internet Computing</w:t>
-      </w:r>
-      <w:r>
-        <w:t xml:space="preserve">, vol. 7, no. 1, pp. 76–80, 2003.</w:t>
+        <w:t xml:space="preserve">Real-time chat</w:t>
+      </w:r>
+      <w:r>
+        <w:t xml:space="preserve"> using WebSockets instead of refreshing for new messages.</w:t>
       </w:r>
     </w:p>
     <w:p>
@@ -4680,16 +5418,13 @@
         </w:numPr>
       </w:pPr>
       <w:r>
-        <w:t xml:space="preserve">Y. Koren, R. Bell and C. Volinsky, “Matrix factorization techniques for recommender systems,” </w:t>
-      </w:r>
-      <w:r>
         <w:rPr>
-          <w:i/>
+          <w:b/>
         </w:rPr>
-        <w:t xml:space="preserve">Computer</w:t>
-      </w:r>
-      <w:r>
-        <w:t xml:space="preserve">, vol. 42, no. 8, pp. 30–37, 2009.</w:t>
+        <w:t xml:space="preserve">Location-based search</w:t>
+      </w:r>
+      <w:r>
+        <w:t xml:space="preserve"> using the phone's GPS to sort dogs by distance.</w:t>
       </w:r>
     </w:p>
     <w:p>
@@ -4701,16 +5436,13 @@
         </w:numPr>
       </w:pPr>
       <w:r>
-        <w:t xml:space="preserve">L. Pizzato, T. Rej, T. Chung, I. Koprinska and J. Kay, “RECON: A reciprocal recommender for online dating,” </w:t>
-      </w:r>
-      <w:r>
         <w:rPr>
-          <w:i/>
+          <w:b/>
         </w:rPr>
-        <w:t xml:space="preserve">Proc. ACM RecSys</w:t>
-      </w:r>
-      <w:r>
-        <w:t xml:space="preserve">, pp. 207–214, 2010.</w:t>
+        <w:t xml:space="preserve">Document scanning</w:t>
+      </w:r>
+      <w:r>
+        <w:t xml:space="preserve"> with the camera and OCR to read vaccination dates.</w:t>
       </w:r>
     </w:p>
     <w:p>
@@ -4722,16 +5454,13 @@
         </w:numPr>
       </w:pPr>
       <w:r>
-        <w:t xml:space="preserve">R. Burke, “Hybrid recommender systems: Survey and experiments,” </w:t>
-      </w:r>
-      <w:r>
         <w:rPr>
-          <w:i/>
+          <w:b/>
         </w:rPr>
-        <w:t xml:space="preserve">User Modeling and User-Adapted Interaction</w:t>
-      </w:r>
-      <w:r>
-        <w:t xml:space="preserve">, vol. 12, pp. 331–370, 2002.</w:t>
+        <w:t xml:space="preserve">Offline mode</w:t>
+      </w:r>
+      <w:r>
+        <w:t xml:space="preserve"> that caches profiles and chats for weak network areas.</w:t>
       </w:r>
     </w:p>
     <w:p>
@@ -4743,9 +5472,179 @@
         </w:numPr>
       </w:pPr>
       <w:r>
+        <w:rPr>
+          <w:b/>
+        </w:rPr>
+        <w:t xml:space="preserve">Learned ranking</w:t>
+      </w:r>
+      <w:r>
+        <w:t xml:space="preserve"> using collaborative filtering once enough likes and matches exist.</w:t>
+      </w:r>
+    </w:p>
+    <w:p>
+      <w:pPr>
+        <w:pStyle w:val="ListParagraph"/>
+        <w:numPr>
+          <w:ilvl w:val="0"/>
+          <w:numId w:val="6"/>
+        </w:numPr>
+      </w:pPr>
+      <w:r>
+        <w:rPr>
+          <w:b/>
+        </w:rPr>
+        <w:t xml:space="preserve">Regional language support</w:t>
+      </w:r>
+      <w:r>
+        <w:t xml:space="preserve"> for owners across India.</w:t>
+      </w:r>
+    </w:p>
+    <w:p>
+      <w:pPr>
+        <w:pStyle w:val="ListParagraph"/>
+        <w:numPr>
+          <w:ilvl w:val="0"/>
+          <w:numId w:val="6"/>
+        </w:numPr>
+      </w:pPr>
+      <w:r>
+        <w:rPr>
+          <w:b/>
+        </w:rPr>
+        <w:t xml:space="preserve">Publishing</w:t>
+      </w:r>
+      <w:r>
+        <w:t xml:space="preserve"> on the Google Play Store and Apple App Store.</w:t>
+      </w:r>
+    </w:p>
+    <w:p>
+      <w:pPr>
+        <w:pStyle w:val="Heading2"/>
+      </w:pPr>
+      <w:r>
+        <w:rPr>
+          <w:i/>
+        </w:rPr>
+        <w:t xml:space="preserve">References</w:t>
+      </w:r>
+    </w:p>
+    <w:p>
+      <w:pPr>
+        <w:pStyle w:val="ListParagraph"/>
+        <w:numPr>
+          <w:ilvl w:val="0"/>
+          <w:numId w:val="7"/>
+        </w:numPr>
+      </w:pPr>
+      <w:r>
+        <w:t xml:space="preserve">F. Ricci, L. Rokach and B. Shapira, </w:t>
+      </w:r>
+      <w:r>
+        <w:rPr>
+          <w:i/>
+        </w:rPr>
+        <w:t xml:space="preserve">Recommender Systems Handbook</w:t>
+      </w:r>
+      <w:r>
+        <w:t xml:space="preserve">, 3rd ed., Springer, 2022.</w:t>
+      </w:r>
+    </w:p>
+    <w:p>
+      <w:pPr>
+        <w:pStyle w:val="ListParagraph"/>
+        <w:numPr>
+          <w:ilvl w:val="0"/>
+          <w:numId w:val="7"/>
+        </w:numPr>
+      </w:pPr>
+      <w:r>
+        <w:t xml:space="preserve">G. Linden, B. Smith and J. York, “Amazon.com recommendations: Item-to-item collaborative filtering,” </w:t>
+      </w:r>
+      <w:r>
+        <w:rPr>
+          <w:i/>
+        </w:rPr>
+        <w:t xml:space="preserve">IEEE Internet Computing</w:t>
+      </w:r>
+      <w:r>
+        <w:t xml:space="preserve">, vol. 7, no. 1, pp. 76–80, 2003.</w:t>
+      </w:r>
+    </w:p>
+    <w:p>
+      <w:pPr>
+        <w:pStyle w:val="ListParagraph"/>
+        <w:numPr>
+          <w:ilvl w:val="0"/>
+          <w:numId w:val="7"/>
+        </w:numPr>
+      </w:pPr>
+      <w:r>
+        <w:t xml:space="preserve">Y. Koren, R. Bell and C. Volinsky, “Matrix factorization techniques for recommender systems,” </w:t>
+      </w:r>
+      <w:r>
+        <w:rPr>
+          <w:i/>
+        </w:rPr>
+        <w:t xml:space="preserve">Computer</w:t>
+      </w:r>
+      <w:r>
+        <w:t xml:space="preserve">, vol. 42, no. 8, pp. 30–37, 2009.</w:t>
+      </w:r>
+    </w:p>
+    <w:p>
+      <w:pPr>
+        <w:pStyle w:val="ListParagraph"/>
+        <w:numPr>
+          <w:ilvl w:val="0"/>
+          <w:numId w:val="7"/>
+        </w:numPr>
+      </w:pPr>
+      <w:r>
+        <w:t xml:space="preserve">L. Pizzato, T. Rej, T. Chung, I. Koprinska and J. Kay, “RECON: A reciprocal recommender for online dating,” </w:t>
+      </w:r>
+      <w:r>
+        <w:rPr>
+          <w:i/>
+        </w:rPr>
+        <w:t xml:space="preserve">Proc. ACM RecSys</w:t>
+      </w:r>
+      <w:r>
+        <w:t xml:space="preserve">, pp. 207–214, 2010.</w:t>
+      </w:r>
+    </w:p>
+    <w:p>
+      <w:pPr>
+        <w:pStyle w:val="ListParagraph"/>
+        <w:numPr>
+          <w:ilvl w:val="0"/>
+          <w:numId w:val="7"/>
+        </w:numPr>
+      </w:pPr>
+      <w:r>
+        <w:t xml:space="preserve">R. Burke, “Hybrid recommender systems: Survey and experiments,” </w:t>
+      </w:r>
+      <w:r>
+        <w:rPr>
+          <w:i/>
+        </w:rPr>
+        <w:t xml:space="preserve">User Modeling and User-Adapted Interaction</w:t>
+      </w:r>
+      <w:r>
+        <w:t xml:space="preserve">, vol. 12, pp. 331–370, 2002.</w:t>
+      </w:r>
+    </w:p>
+    <w:p>
+      <w:pPr>
+        <w:pStyle w:val="ListParagraph"/>
+        <w:numPr>
+          <w:ilvl w:val="0"/>
+          <w:numId w:val="7"/>
+        </w:numPr>
+      </w:pPr>
+      <w:r>
         <w:t xml:space="preserve">Flutter Documentation. </w:t>
       </w:r>
-      <w:hyperlink r:id="rId7" w:history="1">
+      <w:hyperlink r:id="rId8" w:history="1">
         <w:r>
           <w:rPr>
             <w:rStyle w:val="Hyperlink"/>
@@ -4759,13 +5658,13 @@
         <w:pStyle w:val="ListParagraph"/>
         <w:numPr>
           <w:ilvl w:val="0"/>
-          <w:numId w:val="6"/>
+          <w:numId w:val="7"/>
         </w:numPr>
       </w:pPr>
       <w:r>
         <w:t xml:space="preserve">Dart Language Documentation. </w:t>
       </w:r>
-      <w:hyperlink r:id="rId8" w:history="1">
+      <w:hyperlink r:id="rId9" w:history="1">
         <w:r>
           <w:rPr>
             <w:rStyle w:val="Hyperlink"/>
@@ -4779,13 +5678,93 @@
         <w:pStyle w:val="ListParagraph"/>
         <w:numPr>
           <w:ilvl w:val="0"/>
-          <w:numId w:val="6"/>
+          <w:numId w:val="7"/>
         </w:numPr>
       </w:pPr>
       <w:r>
+        <w:t xml:space="preserve">Riverpod Documentation. </w:t>
+      </w:r>
+      <w:hyperlink r:id="rId10" w:history="1">
+        <w:r>
+          <w:rPr>
+            <w:rStyle w:val="Hyperlink"/>
+          </w:rPr>
+          <w:t xml:space="preserve">https://riverpod.dev</w:t>
+        </w:r>
+      </w:hyperlink>
+    </w:p>
+    <w:p>
+      <w:pPr>
+        <w:pStyle w:val="ListParagraph"/>
+        <w:numPr>
+          <w:ilvl w:val="0"/>
+          <w:numId w:val="7"/>
+        </w:numPr>
+      </w:pPr>
+      <w:r>
+        <w:t xml:space="preserve">go_router package. </w:t>
+      </w:r>
+      <w:hyperlink r:id="rId11" w:history="1">
+        <w:r>
+          <w:rPr>
+            <w:rStyle w:val="Hyperlink"/>
+          </w:rPr>
+          <w:t xml:space="preserve">https://pub.dev/packages/go_router</w:t>
+        </w:r>
+      </w:hyperlink>
+    </w:p>
+    <w:p>
+      <w:pPr>
+        <w:pStyle w:val="ListParagraph"/>
+        <w:numPr>
+          <w:ilvl w:val="0"/>
+          <w:numId w:val="7"/>
+        </w:numPr>
+      </w:pPr>
+      <w:r>
+        <w:t xml:space="preserve">dio package. </w:t>
+      </w:r>
+      <w:hyperlink r:id="rId12" w:history="1">
+        <w:r>
+          <w:rPr>
+            <w:rStyle w:val="Hyperlink"/>
+          </w:rPr>
+          <w:t xml:space="preserve">https://pub.dev/packages/dio</w:t>
+        </w:r>
+      </w:hyperlink>
+    </w:p>
+    <w:p>
+      <w:pPr>
+        <w:pStyle w:val="ListParagraph"/>
+        <w:numPr>
+          <w:ilvl w:val="0"/>
+          <w:numId w:val="7"/>
+        </w:numPr>
+      </w:pPr>
+      <w:r>
+        <w:t xml:space="preserve">Better Auth Documentation. </w:t>
+      </w:r>
+      <w:hyperlink r:id="rId13" w:history="1">
+        <w:r>
+          <w:rPr>
+            <w:rStyle w:val="Hyperlink"/>
+          </w:rPr>
+          <w:t xml:space="preserve">https://www.better-auth.com/docs</w:t>
+        </w:r>
+      </w:hyperlink>
+    </w:p>
+    <w:p>
+      <w:pPr>
+        <w:pStyle w:val="ListParagraph"/>
+        <w:numPr>
+          <w:ilvl w:val="0"/>
+          <w:numId w:val="7"/>
+        </w:numPr>
+      </w:pPr>
+      <w:r>
         <w:t xml:space="preserve">Material Design 3 Guidelines. </w:t>
       </w:r>
-      <w:hyperlink r:id="rId9" w:history="1">
+      <w:hyperlink r:id="rId14" w:history="1">
         <w:r>
           <w:rPr>
             <w:rStyle w:val="Hyperlink"/>
@@ -4799,33 +5778,13 @@
         <w:pStyle w:val="ListParagraph"/>
         <w:numPr>
           <w:ilvl w:val="0"/>
-          <w:numId w:val="6"/>
+          <w:numId w:val="7"/>
         </w:numPr>
       </w:pPr>
       <w:r>
-        <w:t xml:space="preserve">pub.dev — Dart and Flutter package repository. </w:t>
-      </w:r>
-      <w:hyperlink r:id="rId10" w:history="1">
-        <w:r>
-          <w:rPr>
-            <w:rStyle w:val="Hyperlink"/>
-          </w:rPr>
-          <w:t xml:space="preserve">https://pub.dev</w:t>
-        </w:r>
-      </w:hyperlink>
-    </w:p>
-    <w:p>
-      <w:pPr>
-        <w:pStyle w:val="ListParagraph"/>
-        <w:numPr>
-          <w:ilvl w:val="0"/>
-          <w:numId w:val="6"/>
-        </w:numPr>
-      </w:pPr>
-      <w:r>
         <w:t xml:space="preserve">Web Content Accessibility Guidelines (WCAG) 2.2, W3C. </w:t>
       </w:r>
-      <w:hyperlink r:id="rId11" w:history="1">
+      <w:hyperlink r:id="rId15" w:history="1">
         <w:r>
           <w:rPr>
             <w:rStyle w:val="Hyperlink"/>
@@ -5028,12 +5987,15 @@
     <w:abstractNumId w:val="0"/>
   </w:num>
   <w:num w:numId="5">
+    <w:abstractNumId w:val="0"/>
+  </w:num>
+  <w:num w:numId="6">
     <w:abstractNumId w:val="1"/>
     <w:lvlOverride w:ilvl="0">
       <w:startOverride w:val="1"/>
     </w:lvlOverride>
   </w:num>
-  <w:num w:numId="6">
+  <w:num w:numId="7">
     <w:abstractNumId w:val="1"/>
     <w:lvlOverride w:ilvl="0">
       <w:startOverride w:val="1"/>

</xml_diff>